<commit_message>
Cambios en la plantilla de memorandum
</commit_message>
<xml_diff>
--- a/api/src/main/resources/plantillas/plantilla_memorandum.docx
+++ b/api/src/main/resources/plantillas/plantilla_memorandum.docx
@@ -144,6 +144,14 @@
           <w:bCs/>
         </w:rPr>
       </w:pPr>
+      <w:r>
+        <w:rPr>
+          <w:rFonts w:ascii="Arial Narrow" w:hAnsi="Arial Narrow" w:cs="Arial"/>
+          <w:b/>
+          <w:bCs/>
+        </w:rPr>
+        <w:t>{{USUARIO_ENCARGADO}}</w:t>
+      </w:r>
     </w:p>
     <w:p>
       <w:pPr>
@@ -154,6 +162,22 @@
           <w:bCs/>
         </w:rPr>
       </w:pPr>
+      <w:r>
+        <w:rPr>
+          <w:rFonts w:ascii="Arial Narrow" w:hAnsi="Arial Narrow" w:cs="Arial"/>
+          <w:b/>
+          <w:bCs/>
+        </w:rPr>
+        <w:t>{{CARGO_ENCARGADO}}</w:t>
+      </w:r>
+      <w:r>
+        <w:rPr>
+          <w:rFonts w:ascii="Arial Narrow" w:hAnsi="Arial Narrow" w:cs="Arial"/>
+          <w:b/>
+          <w:bCs/>
+        </w:rPr>
+        <w:t xml:space="preserve"> </w:t>
+      </w:r>
       <w:r>
         <w:rPr>
           <w:rFonts w:ascii="Arial Narrow" w:hAnsi="Arial Narrow" w:cs="Arial"/>
@@ -227,17 +251,27 @@
       </w:pPr>
       <w:r>
         <w:rPr>
-          <w:rFonts w:ascii="Arial Narrow" w:hAnsi="Arial Narrow" w:cs="Arial"/>
-          <w:bCs/>
-        </w:rPr>
-        <w:t>Por este conducto</w:t>
-      </w:r>
-      <w:r>
-        <w:rPr>
-          <w:rFonts w:ascii="Arial Narrow" w:hAnsi="Arial Narrow" w:cs="Arial"/>
-          <w:bCs/>
-        </w:rPr>
-        <w:t>, remito a Usted el oficio</w:t>
+          <w:rFonts w:ascii="Arial Narrow" w:hAnsi="Arial Narrow"/>
+        </w:rPr>
+        <w:t xml:space="preserve">En atención a su memorándum número </w:t>
+      </w:r>
+      <w:r>
+        <w:rPr>
+          <w:rFonts w:ascii="Arial Narrow" w:hAnsi="Arial Narrow"/>
+        </w:rPr>
+        <w:t>{{NUM_OFICIO}}</w:t>
+      </w:r>
+      <w:r>
+        <w:rPr>
+          <w:rFonts w:ascii="Arial Narrow" w:hAnsi="Arial Narrow"/>
+        </w:rPr>
+        <w:t xml:space="preserve">, </w:t>
+      </w:r>
+      <w:r>
+        <w:rPr>
+          <w:rFonts w:ascii="Arial Narrow" w:hAnsi="Arial Narrow"/>
+        </w:rPr>
+        <w:t>informo a Usted que</w:t>
       </w:r>
       <w:r>
         <w:rPr>
@@ -245,76 +279,6 @@
           <w:bCs/>
         </w:rPr>
         <w:t xml:space="preserve"> </w:t>
-      </w:r>
-      <w:r>
-        <w:rPr>
-          <w:rFonts w:ascii="Arial Narrow" w:hAnsi="Arial Narrow" w:cs="Arial"/>
-          <w:bCs/>
-        </w:rPr>
-        <w:t>{{FOLIO}}</w:t>
-      </w:r>
-      <w:r>
-        <w:rPr>
-          <w:rFonts w:ascii="Arial Narrow" w:hAnsi="Arial Narrow" w:cs="Arial"/>
-          <w:bCs/>
-        </w:rPr>
-        <w:t xml:space="preserve">, emitido por </w:t>
-      </w:r>
-      <w:r>
-        <w:rPr>
-          <w:rFonts w:ascii="Arial Narrow" w:hAnsi="Arial Narrow" w:cs="Arial"/>
-          <w:bCs/>
-        </w:rPr>
-        <w:t xml:space="preserve">el </w:t>
-      </w:r>
-      <w:r>
-        <w:rPr>
-          <w:rFonts w:ascii="Arial Narrow" w:hAnsi="Arial Narrow" w:cs="Arial"/>
-          <w:bCs/>
-        </w:rPr>
-        <w:t>{{</w:t>
-      </w:r>
-      <w:r>
-        <w:rPr>
-          <w:rFonts w:ascii="Arial Narrow" w:hAnsi="Arial Narrow" w:cs="Arial"/>
-          <w:bCs/>
-        </w:rPr>
-        <w:t>NOMBRE_EMISOR</w:t>
-      </w:r>
-      <w:r>
-        <w:rPr>
-          <w:rFonts w:ascii="Arial Narrow" w:hAnsi="Arial Narrow" w:cs="Arial"/>
-          <w:bCs/>
-        </w:rPr>
-        <w:t>}</w:t>
-      </w:r>
-      <w:r>
-        <w:rPr>
-          <w:rFonts w:ascii="Arial Narrow" w:hAnsi="Arial Narrow" w:cs="Arial"/>
-          <w:bCs/>
-        </w:rPr>
-        <w:t>}</w:t>
-      </w:r>
-      <w:r>
-        <w:rPr>
-          <w:rFonts w:ascii="Arial Narrow" w:hAnsi="Arial Narrow" w:cs="Arial"/>
-          <w:bCs/>
-        </w:rPr>
-        <w:t xml:space="preserve">, </w:t>
-      </w:r>
-      <w:r>
-        <w:rPr>
-          <w:rFonts w:ascii="Arial Narrow" w:hAnsi="Arial Narrow" w:cs="Arial"/>
-          <w:bCs/>
-        </w:rPr>
-        <w:t xml:space="preserve">Encargado de </w:t>
-      </w:r>
-      <w:r>
-        <w:rPr>
-          <w:rFonts w:ascii="Arial Narrow" w:hAnsi="Arial Narrow" w:cs="Arial"/>
-          <w:bCs/>
-        </w:rPr>
-        <w:t xml:space="preserve">{{AREA_DESTINATARIO}} </w:t>
       </w:r>
       <w:r>
         <w:rPr>
@@ -489,13 +453,23 @@
           <w:rFonts w:ascii="Arial Narrow" w:hAnsi="Arial Narrow"/>
         </w:rPr>
       </w:pPr>
+      <w:proofErr w:type="spellStart"/>
       <w:r>
         <w:rPr>
           <w:rFonts w:ascii="Arial Narrow" w:hAnsi="Arial Narrow" w:cs="Arial"/>
           <w:sz w:val="16"/>
           <w:szCs w:val="16"/>
         </w:rPr>
-        <w:t>C.c.p. Archivo.</w:t>
+        <w:t>C.c.p</w:t>
+      </w:r>
+      <w:proofErr w:type="spellEnd"/>
+      <w:r>
+        <w:rPr>
+          <w:rFonts w:ascii="Arial Narrow" w:hAnsi="Arial Narrow" w:cs="Arial"/>
+          <w:sz w:val="16"/>
+          <w:szCs w:val="16"/>
+        </w:rPr>
+        <w:t>. Archivo.</w:t>
       </w:r>
     </w:p>
     <w:p>
@@ -1024,7 +998,6 @@
   <w:style w:type="character" w:default="1" w:styleId="Fuentedeprrafopredeter">
     <w:name w:val="Default Paragraph Font"/>
     <w:uiPriority w:val="1"/>
-    <w:semiHidden/>
     <w:unhideWhenUsed/>
   </w:style>
   <w:style w:type="table" w:default="1" w:styleId="Tablanormal">

</xml_diff>